<commit_message>
Merge Table 1C into Table 1B as single "Pre-vaccine hr-HPV+" row
Instead of a separate clearance-subset baseline table (Table 1C),
add one row to Table 1B that captures the subset-defining condition:

  HPV history
    Pre-vaccine hr-HPV+ (clearance analytic subset)
      110 (45.6%) vs 182 (21.0%)   p<0.001   |SMD|=0.542

The Table 1B caption explains that the |SMD|=0.54 on this single
row reflects differential pre-vaccine molecular-pathology test
frequency between vaccinated and unvaccinated women rather than a
balance failure of the fine matching on the other covariates.

Counts/p/SMD computed against Data/CohortB_Clearance_Analytic.csv
(110 vac / 182 ctl) and Data/final_matched_outcomes.csv (241 / 867)
using Fisher exact and the standard SMD formula for proportions.

Effect: tables_figures docx now has 4 main tables (1A, 1B, 2, 3)
instead of 5 (1A, 1B, 1C, 2, 3); v2 file regenerated identically.

Co-Authored-By: Claude Opus 4.7 (1M context) <noreply@anthropic.com>
</commit_message>
<xml_diff>
--- a/docs/HPV_tables_figures.docx
+++ b/docs/HPV_tables_figures.docx
@@ -2204,7 +2204,7 @@
         <w:t>Table 1B</w:t>
       </w:r>
       <w:r>
-        <w:t>. Baseline characteristics after 1:up-to-4 fine matching — Cohort B (post-surgical efficacy analysis). N = 1,108 (241 vaccinated / 867 unvaccinated; mean realised ratio 3.60). Absolute standardised mean differences (|SMD|) &lt; 0.10 indicate adequate balance.</w:t>
+        <w:t>. Baseline characteristics after 1:up-to-4 fine matching — Cohort B (post-surgical efficacy analysis). N = 1,108 (241 vaccinated / 867 unvaccinated; mean realised ratio 3.60). Absolute standardised mean differences (|SMD|) &lt; 0.10 indicate adequate balance. The final row (Pre-vaccine hr-HPV+) defines the clearance co-primary analytic subset (n = 292: 110 vaccinated / 182 unvaccinated); the large |SMD| on this row reflects differential pre-vaccine molecular-pathology test frequency rather than a balance failure of the fine matching on the other covariates.</w:t>
       </w:r>
     </w:p>
     <w:p/>
@@ -4584,116 +4584,70 @@
           </w:p>
         </w:tc>
       </w:tr>
-    </w:tbl>
-    <w:p>
-      <w:r>
-        <w:br w:type="page"/>
-      </w:r>
-    </w:p>
-    <w:p>
-      <w:r>
-        <w:rPr>
-          <w:b/>
-        </w:rPr>
-        <w:t>Table 1C</w:t>
-      </w:r>
-      <w:r>
-        <w:t>. Baseline characteristics — Cohort B clearance subset (women with documented pre-vaccine hr-HPV positivity; analytic population for the hr-HPV clearance co-primary outcome). N = 292 (110 vaccinated / 182 unvaccinated). Matched-set integrity preserved by dropping fine_match_ids whose vaccinated case lacked a pre-vaccine molecular pathology record.</w:t>
-      </w:r>
-    </w:p>
-    <w:p/>
-    <w:tbl>
-      <w:tblPr>
-        <w:tblStyle w:val="LightGrid-Accent1"/>
-        <w:tblW w:type="auto" w:w="0"/>
-        <w:tblLayout w:type="fixed"/>
-        <w:tblLook w:firstColumn="1" w:firstRow="1" w:lastColumn="0" w:lastRow="0" w:noHBand="0" w:noVBand="1" w:val="04A0"/>
-      </w:tblPr>
-      <w:tblGrid>
-        <w:gridCol w:w="1994"/>
-        <w:gridCol w:w="1994"/>
-        <w:gridCol w:w="1994"/>
-        <w:gridCol w:w="1994"/>
-        <w:gridCol w:w="1994"/>
-      </w:tblGrid>
       <w:tr>
         <w:tc>
           <w:tcPr>
             <w:tcW w:type="dxa" w:w="3456"/>
-            <w:vAlign w:val="center"/>
-          </w:tcPr>
-          <w:p>
-            <w:r/>
-            <w:r>
-              <w:rPr>
-                <w:b/>
-                <w:sz w:val="18"/>
-              </w:rPr>
-              <w:t>Variable</w:t>
+          </w:tcPr>
+          <w:p>
+            <w:r/>
+            <w:r>
+              <w:rPr>
+                <w:sz w:val="18"/>
+              </w:rPr>
+              <w:t>HPV history</w:t>
             </w:r>
           </w:p>
         </w:tc>
         <w:tc>
           <w:tcPr>
             <w:tcW w:type="dxa" w:w="1584"/>
-            <w:vAlign w:val="center"/>
-          </w:tcPr>
-          <w:p>
-            <w:r/>
-            <w:r>
-              <w:rPr>
-                <w:b/>
-                <w:sz w:val="18"/>
-              </w:rPr>
-              <w:t>Vaccinated</w:t>
+          </w:tcPr>
+          <w:p>
+            <w:r/>
+            <w:r>
+              <w:rPr>
+                <w:sz w:val="18"/>
+              </w:rPr>
             </w:r>
           </w:p>
         </w:tc>
         <w:tc>
           <w:tcPr>
             <w:tcW w:type="dxa" w:w="1728"/>
-            <w:vAlign w:val="center"/>
-          </w:tcPr>
-          <w:p>
-            <w:r/>
-            <w:r>
-              <w:rPr>
-                <w:b/>
-                <w:sz w:val="18"/>
-              </w:rPr>
-              <w:t>Non-vaccinated</w:t>
+          </w:tcPr>
+          <w:p>
+            <w:r/>
+            <w:r>
+              <w:rPr>
+                <w:sz w:val="18"/>
+              </w:rPr>
             </w:r>
           </w:p>
         </w:tc>
         <w:tc>
           <w:tcPr>
             <w:tcW w:type="dxa" w:w="864"/>
-            <w:vAlign w:val="center"/>
-          </w:tcPr>
-          <w:p>
-            <w:r/>
-            <w:r>
-              <w:rPr>
-                <w:b/>
-                <w:sz w:val="18"/>
-              </w:rPr>
-              <w:t>p value</w:t>
+          </w:tcPr>
+          <w:p>
+            <w:r/>
+            <w:r>
+              <w:rPr>
+                <w:sz w:val="18"/>
+              </w:rPr>
             </w:r>
           </w:p>
         </w:tc>
         <w:tc>
           <w:tcPr>
             <w:tcW w:type="dxa" w:w="864"/>
-            <w:vAlign w:val="center"/>
-          </w:tcPr>
-          <w:p>
-            <w:r/>
-            <w:r>
-              <w:rPr>
-                <w:b/>
-                <w:sz w:val="18"/>
-              </w:rPr>
-              <w:t>|SMD|</w:t>
+          </w:tcPr>
+          <w:p>
+            <w:r/>
+            <w:r>
+              <w:rPr>
+                <w:sz w:val="18"/>
+              </w:rPr>
             </w:r>
           </w:p>
         </w:tc>
@@ -4709,7 +4663,7 @@
               <w:rPr>
                 <w:sz w:val="18"/>
               </w:rPr>
-              <w:t>N (analytic subset, pre-vaccine hr-HPV+)</w:t>
+              <w:t xml:space="preserve">  Pre-vaccine hr-HPV+ (clearance analytic subset)</w:t>
             </w:r>
           </w:p>
         </w:tc>
@@ -4723,7 +4677,7 @@
               <w:rPr>
                 <w:sz w:val="18"/>
               </w:rPr>
-              <w:t>110</w:t>
+              <w:t>110 (45.6%)</w:t>
             </w:r>
           </w:p>
         </w:tc>
@@ -4737,7 +4691,7 @@
               <w:rPr>
                 <w:sz w:val="18"/>
               </w:rPr>
-              <w:t>182</w:t>
+              <w:t>182 (21.0%)</w:t>
             </w:r>
           </w:p>
         </w:tc>
@@ -4751,6 +4705,7 @@
               <w:rPr>
                 <w:sz w:val="18"/>
               </w:rPr>
+              <w:t>&lt;0.001</w:t>
             </w:r>
           </w:p>
         </w:tc>
@@ -4764,1142 +4719,7 @@
               <w:rPr>
                 <w:sz w:val="18"/>
               </w:rPr>
-            </w:r>
-          </w:p>
-        </w:tc>
-      </w:tr>
-      <w:tr>
-        <w:tc>
-          <w:tcPr>
-            <w:tcW w:type="dxa" w:w="3456"/>
-          </w:tcPr>
-          <w:p>
-            <w:r/>
-            <w:r>
-              <w:rPr>
-                <w:sz w:val="18"/>
-              </w:rPr>
-              <w:t>Demographics</w:t>
-            </w:r>
-          </w:p>
-        </w:tc>
-        <w:tc>
-          <w:tcPr>
-            <w:tcW w:type="dxa" w:w="1584"/>
-          </w:tcPr>
-          <w:p>
-            <w:r/>
-            <w:r>
-              <w:rPr>
-                <w:sz w:val="18"/>
-              </w:rPr>
-            </w:r>
-          </w:p>
-        </w:tc>
-        <w:tc>
-          <w:tcPr>
-            <w:tcW w:type="dxa" w:w="1728"/>
-          </w:tcPr>
-          <w:p>
-            <w:r/>
-            <w:r>
-              <w:rPr>
-                <w:sz w:val="18"/>
-              </w:rPr>
-            </w:r>
-          </w:p>
-        </w:tc>
-        <w:tc>
-          <w:tcPr>
-            <w:tcW w:type="dxa" w:w="864"/>
-          </w:tcPr>
-          <w:p>
-            <w:r/>
-            <w:r>
-              <w:rPr>
-                <w:sz w:val="18"/>
-              </w:rPr>
-            </w:r>
-          </w:p>
-        </w:tc>
-        <w:tc>
-          <w:tcPr>
-            <w:tcW w:type="dxa" w:w="864"/>
-          </w:tcPr>
-          <w:p>
-            <w:r/>
-            <w:r>
-              <w:rPr>
-                <w:sz w:val="18"/>
-              </w:rPr>
-            </w:r>
-          </w:p>
-        </w:tc>
-      </w:tr>
-      <w:tr>
-        <w:tc>
-          <w:tcPr>
-            <w:tcW w:type="dxa" w:w="3456"/>
-          </w:tcPr>
-          <w:p>
-            <w:r/>
-            <w:r>
-              <w:rPr>
-                <w:sz w:val="18"/>
-              </w:rPr>
-              <w:t xml:space="preserve">  Age at index, years</w:t>
-            </w:r>
-          </w:p>
-        </w:tc>
-        <w:tc>
-          <w:tcPr>
-            <w:tcW w:type="dxa" w:w="1584"/>
-          </w:tcPr>
-          <w:p>
-            <w:r/>
-            <w:r>
-              <w:rPr>
-                <w:sz w:val="18"/>
-              </w:rPr>
-              <w:t>35.49 ± 8.11</w:t>
-            </w:r>
-          </w:p>
-        </w:tc>
-        <w:tc>
-          <w:tcPr>
-            <w:tcW w:type="dxa" w:w="1728"/>
-          </w:tcPr>
-          <w:p>
-            <w:r/>
-            <w:r>
-              <w:rPr>
-                <w:sz w:val="18"/>
-              </w:rPr>
-              <w:t>35.78 ± 7.40</w:t>
-            </w:r>
-          </w:p>
-        </w:tc>
-        <w:tc>
-          <w:tcPr>
-            <w:tcW w:type="dxa" w:w="864"/>
-          </w:tcPr>
-          <w:p>
-            <w:r/>
-            <w:r>
-              <w:rPr>
-                <w:sz w:val="18"/>
-              </w:rPr>
-              <w:t>0.760</w:t>
-            </w:r>
-          </w:p>
-        </w:tc>
-        <w:tc>
-          <w:tcPr>
-            <w:tcW w:type="dxa" w:w="864"/>
-          </w:tcPr>
-          <w:p>
-            <w:r/>
-            <w:r>
-              <w:rPr>
-                <w:sz w:val="18"/>
-              </w:rPr>
-              <w:t>0.037</w:t>
-            </w:r>
-          </w:p>
-        </w:tc>
-      </w:tr>
-      <w:tr>
-        <w:tc>
-          <w:tcPr>
-            <w:tcW w:type="dxa" w:w="3456"/>
-          </w:tcPr>
-          <w:p>
-            <w:r/>
-            <w:r>
-              <w:rPr>
-                <w:sz w:val="18"/>
-              </w:rPr>
-              <w:t xml:space="preserve">  Birth year</w:t>
-            </w:r>
-          </w:p>
-        </w:tc>
-        <w:tc>
-          <w:tcPr>
-            <w:tcW w:type="dxa" w:w="1584"/>
-          </w:tcPr>
-          <w:p>
-            <w:r/>
-            <w:r>
-              <w:rPr>
-                <w:sz w:val="18"/>
-              </w:rPr>
-              <w:t>1981.25 ± 9.12</w:t>
-            </w:r>
-          </w:p>
-        </w:tc>
-        <w:tc>
-          <w:tcPr>
-            <w:tcW w:type="dxa" w:w="1728"/>
-          </w:tcPr>
-          <w:p>
-            <w:r/>
-            <w:r>
-              <w:rPr>
-                <w:sz w:val="18"/>
-              </w:rPr>
-              <w:t>1981.42 ± 8.14</w:t>
-            </w:r>
-          </w:p>
-        </w:tc>
-        <w:tc>
-          <w:tcPr>
-            <w:tcW w:type="dxa" w:w="864"/>
-          </w:tcPr>
-          <w:p>
-            <w:r/>
-            <w:r>
-              <w:rPr>
-                <w:sz w:val="18"/>
-              </w:rPr>
-              <w:t>0.867</w:t>
-            </w:r>
-          </w:p>
-        </w:tc>
-        <w:tc>
-          <w:tcPr>
-            <w:tcW w:type="dxa" w:w="864"/>
-          </w:tcPr>
-          <w:p>
-            <w:r/>
-            <w:r>
-              <w:rPr>
-                <w:sz w:val="18"/>
-              </w:rPr>
-              <w:t>0.021</w:t>
-            </w:r>
-          </w:p>
-        </w:tc>
-      </w:tr>
-      <w:tr>
-        <w:tc>
-          <w:tcPr>
-            <w:tcW w:type="dxa" w:w="3456"/>
-          </w:tcPr>
-          <w:p>
-            <w:r/>
-            <w:r>
-              <w:rPr>
-                <w:sz w:val="18"/>
-              </w:rPr>
-              <w:t xml:space="preserve">  Index year</w:t>
-            </w:r>
-          </w:p>
-        </w:tc>
-        <w:tc>
-          <w:tcPr>
-            <w:tcW w:type="dxa" w:w="1584"/>
-          </w:tcPr>
-          <w:p>
-            <w:r/>
-            <w:r>
-              <w:rPr>
-                <w:sz w:val="18"/>
-              </w:rPr>
-              <w:t>2016.70 ± 3.58</w:t>
-            </w:r>
-          </w:p>
-        </w:tc>
-        <w:tc>
-          <w:tcPr>
-            <w:tcW w:type="dxa" w:w="1728"/>
-          </w:tcPr>
-          <w:p>
-            <w:r/>
-            <w:r>
-              <w:rPr>
-                <w:sz w:val="18"/>
-              </w:rPr>
-              <w:t>2017.20 ± 3.33</w:t>
-            </w:r>
-          </w:p>
-        </w:tc>
-        <w:tc>
-          <w:tcPr>
-            <w:tcW w:type="dxa" w:w="864"/>
-          </w:tcPr>
-          <w:p>
-            <w:r/>
-            <w:r>
-              <w:rPr>
-                <w:sz w:val="18"/>
-              </w:rPr>
-              <w:t>0.238</w:t>
-            </w:r>
-          </w:p>
-        </w:tc>
-        <w:tc>
-          <w:tcPr>
-            <w:tcW w:type="dxa" w:w="864"/>
-          </w:tcPr>
-          <w:p>
-            <w:r/>
-            <w:r>
-              <w:rPr>
-                <w:sz w:val="18"/>
-              </w:rPr>
-              <w:t>0.144</w:t>
-            </w:r>
-          </w:p>
-        </w:tc>
-      </w:tr>
-      <w:tr>
-        <w:tc>
-          <w:tcPr>
-            <w:tcW w:type="dxa" w:w="3456"/>
-          </w:tcPr>
-          <w:p>
-            <w:r/>
-            <w:r>
-              <w:rPr>
-                <w:sz w:val="18"/>
-              </w:rPr>
-              <w:t>Anthropometry</w:t>
-            </w:r>
-          </w:p>
-        </w:tc>
-        <w:tc>
-          <w:tcPr>
-            <w:tcW w:type="dxa" w:w="1584"/>
-          </w:tcPr>
-          <w:p>
-            <w:r/>
-            <w:r>
-              <w:rPr>
-                <w:sz w:val="18"/>
-              </w:rPr>
-            </w:r>
-          </w:p>
-        </w:tc>
-        <w:tc>
-          <w:tcPr>
-            <w:tcW w:type="dxa" w:w="1728"/>
-          </w:tcPr>
-          <w:p>
-            <w:r/>
-            <w:r>
-              <w:rPr>
-                <w:sz w:val="18"/>
-              </w:rPr>
-            </w:r>
-          </w:p>
-        </w:tc>
-        <w:tc>
-          <w:tcPr>
-            <w:tcW w:type="dxa" w:w="864"/>
-          </w:tcPr>
-          <w:p>
-            <w:r/>
-            <w:r>
-              <w:rPr>
-                <w:sz w:val="18"/>
-              </w:rPr>
-            </w:r>
-          </w:p>
-        </w:tc>
-        <w:tc>
-          <w:tcPr>
-            <w:tcW w:type="dxa" w:w="864"/>
-          </w:tcPr>
-          <w:p>
-            <w:r/>
-            <w:r>
-              <w:rPr>
-                <w:sz w:val="18"/>
-              </w:rPr>
-            </w:r>
-          </w:p>
-        </w:tc>
-      </w:tr>
-      <w:tr>
-        <w:tc>
-          <w:tcPr>
-            <w:tcW w:type="dxa" w:w="3456"/>
-          </w:tcPr>
-          <w:p>
-            <w:r/>
-            <w:r>
-              <w:rPr>
-                <w:sz w:val="18"/>
-              </w:rPr>
-              <w:t xml:space="preserve">  BMI, kg/m² (closest to index)</w:t>
-            </w:r>
-          </w:p>
-        </w:tc>
-        <w:tc>
-          <w:tcPr>
-            <w:tcW w:type="dxa" w:w="1584"/>
-          </w:tcPr>
-          <w:p>
-            <w:r/>
-            <w:r>
-              <w:rPr>
-                <w:sz w:val="18"/>
-              </w:rPr>
-              <w:t>22.21 ± 3.27</w:t>
-            </w:r>
-          </w:p>
-        </w:tc>
-        <w:tc>
-          <w:tcPr>
-            <w:tcW w:type="dxa" w:w="1728"/>
-          </w:tcPr>
-          <w:p>
-            <w:r/>
-            <w:r>
-              <w:rPr>
-                <w:sz w:val="18"/>
-              </w:rPr>
-              <w:t>21.78 ± 3.00</w:t>
-            </w:r>
-          </w:p>
-        </w:tc>
-        <w:tc>
-          <w:tcPr>
-            <w:tcW w:type="dxa" w:w="864"/>
-          </w:tcPr>
-          <w:p>
-            <w:r/>
-            <w:r>
-              <w:rPr>
-                <w:sz w:val="18"/>
-              </w:rPr>
-              <w:t>0.301</w:t>
-            </w:r>
-          </w:p>
-        </w:tc>
-        <w:tc>
-          <w:tcPr>
-            <w:tcW w:type="dxa" w:w="864"/>
-          </w:tcPr>
-          <w:p>
-            <w:r/>
-            <w:r>
-              <w:rPr>
-                <w:sz w:val="18"/>
-              </w:rPr>
-              <w:t>0.137</w:t>
-            </w:r>
-          </w:p>
-        </w:tc>
-      </w:tr>
-      <w:tr>
-        <w:tc>
-          <w:tcPr>
-            <w:tcW w:type="dxa" w:w="3456"/>
-          </w:tcPr>
-          <w:p>
-            <w:r/>
-            <w:r>
-              <w:rPr>
-                <w:sz w:val="18"/>
-              </w:rPr>
-              <w:t xml:space="preserve">  BMI missing</w:t>
-            </w:r>
-          </w:p>
-        </w:tc>
-        <w:tc>
-          <w:tcPr>
-            <w:tcW w:type="dxa" w:w="1584"/>
-          </w:tcPr>
-          <w:p>
-            <w:r/>
-            <w:r>
-              <w:rPr>
-                <w:sz w:val="18"/>
-              </w:rPr>
-              <w:t>18 (16.4%)</w:t>
-            </w:r>
-          </w:p>
-        </w:tc>
-        <w:tc>
-          <w:tcPr>
-            <w:tcW w:type="dxa" w:w="1728"/>
-          </w:tcPr>
-          <w:p>
-            <w:r/>
-            <w:r>
-              <w:rPr>
-                <w:sz w:val="18"/>
-              </w:rPr>
-              <w:t>19 (10.4%)</w:t>
-            </w:r>
-          </w:p>
-        </w:tc>
-        <w:tc>
-          <w:tcPr>
-            <w:tcW w:type="dxa" w:w="864"/>
-          </w:tcPr>
-          <w:p>
-            <w:r/>
-            <w:r>
-              <w:rPr>
-                <w:sz w:val="18"/>
-              </w:rPr>
-              <w:t>0.150</w:t>
-            </w:r>
-          </w:p>
-        </w:tc>
-        <w:tc>
-          <w:tcPr>
-            <w:tcW w:type="dxa" w:w="864"/>
-          </w:tcPr>
-          <w:p>
-            <w:r/>
-            <w:r>
-              <w:rPr>
-                <w:sz w:val="18"/>
-              </w:rPr>
-              <w:t>0.175</w:t>
-            </w:r>
-          </w:p>
-        </w:tc>
-      </w:tr>
-      <w:tr>
-        <w:tc>
-          <w:tcPr>
-            <w:tcW w:type="dxa" w:w="3456"/>
-          </w:tcPr>
-          <w:p>
-            <w:r/>
-            <w:r>
-              <w:rPr>
-                <w:sz w:val="18"/>
-              </w:rPr>
-              <w:t>Surgery</w:t>
-            </w:r>
-          </w:p>
-        </w:tc>
-        <w:tc>
-          <w:tcPr>
-            <w:tcW w:type="dxa" w:w="1584"/>
-          </w:tcPr>
-          <w:p>
-            <w:r/>
-            <w:r>
-              <w:rPr>
-                <w:sz w:val="18"/>
-              </w:rPr>
-            </w:r>
-          </w:p>
-        </w:tc>
-        <w:tc>
-          <w:tcPr>
-            <w:tcW w:type="dxa" w:w="1728"/>
-          </w:tcPr>
-          <w:p>
-            <w:r/>
-            <w:r>
-              <w:rPr>
-                <w:sz w:val="18"/>
-              </w:rPr>
-            </w:r>
-          </w:p>
-        </w:tc>
-        <w:tc>
-          <w:tcPr>
-            <w:tcW w:type="dxa" w:w="864"/>
-          </w:tcPr>
-          <w:p>
-            <w:r/>
-            <w:r>
-              <w:rPr>
-                <w:sz w:val="18"/>
-              </w:rPr>
-            </w:r>
-          </w:p>
-        </w:tc>
-        <w:tc>
-          <w:tcPr>
-            <w:tcW w:type="dxa" w:w="864"/>
-          </w:tcPr>
-          <w:p>
-            <w:r/>
-            <w:r>
-              <w:rPr>
-                <w:sz w:val="18"/>
-              </w:rPr>
-            </w:r>
-          </w:p>
-        </w:tc>
-      </w:tr>
-      <w:tr>
-        <w:tc>
-          <w:tcPr>
-            <w:tcW w:type="dxa" w:w="3456"/>
-          </w:tcPr>
-          <w:p>
-            <w:r/>
-            <w:r>
-              <w:rPr>
-                <w:sz w:val="18"/>
-              </w:rPr>
-              <w:t xml:space="preserve">  Hysterectomy</w:t>
-            </w:r>
-          </w:p>
-        </w:tc>
-        <w:tc>
-          <w:tcPr>
-            <w:tcW w:type="dxa" w:w="1584"/>
-          </w:tcPr>
-          <w:p>
-            <w:r/>
-            <w:r>
-              <w:rPr>
-                <w:sz w:val="18"/>
-              </w:rPr>
-              <w:t>0 (0.0%)</w:t>
-            </w:r>
-          </w:p>
-        </w:tc>
-        <w:tc>
-          <w:tcPr>
-            <w:tcW w:type="dxa" w:w="1728"/>
-          </w:tcPr>
-          <w:p>
-            <w:r/>
-            <w:r>
-              <w:rPr>
-                <w:sz w:val="18"/>
-              </w:rPr>
-              <w:t>1 (0.5%)</w:t>
-            </w:r>
-          </w:p>
-        </w:tc>
-        <w:tc>
-          <w:tcPr>
-            <w:tcW w:type="dxa" w:w="864"/>
-          </w:tcPr>
-          <w:p>
-            <w:r/>
-            <w:r>
-              <w:rPr>
-                <w:sz w:val="18"/>
-              </w:rPr>
-              <w:t>1.000</w:t>
-            </w:r>
-          </w:p>
-        </w:tc>
-        <w:tc>
-          <w:tcPr>
-            <w:tcW w:type="dxa" w:w="864"/>
-          </w:tcPr>
-          <w:p>
-            <w:r/>
-            <w:r>
-              <w:rPr>
-                <w:sz w:val="18"/>
-              </w:rPr>
-              <w:t>0.105</w:t>
-            </w:r>
-          </w:p>
-        </w:tc>
-      </w:tr>
-      <w:tr>
-        <w:tc>
-          <w:tcPr>
-            <w:tcW w:type="dxa" w:w="3456"/>
-          </w:tcPr>
-          <w:p>
-            <w:r/>
-            <w:r>
-              <w:rPr>
-                <w:sz w:val="18"/>
-              </w:rPr>
-              <w:t xml:space="preserve">  Conization</w:t>
-            </w:r>
-          </w:p>
-        </w:tc>
-        <w:tc>
-          <w:tcPr>
-            <w:tcW w:type="dxa" w:w="1584"/>
-          </w:tcPr>
-          <w:p>
-            <w:r/>
-            <w:r>
-              <w:rPr>
-                <w:sz w:val="18"/>
-              </w:rPr>
-              <w:t>110 (100.0%)</w:t>
-            </w:r>
-          </w:p>
-        </w:tc>
-        <w:tc>
-          <w:tcPr>
-            <w:tcW w:type="dxa" w:w="1728"/>
-          </w:tcPr>
-          <w:p>
-            <w:r/>
-            <w:r>
-              <w:rPr>
-                <w:sz w:val="18"/>
-              </w:rPr>
-              <w:t>181 (99.5%)</w:t>
-            </w:r>
-          </w:p>
-        </w:tc>
-        <w:tc>
-          <w:tcPr>
-            <w:tcW w:type="dxa" w:w="864"/>
-          </w:tcPr>
-          <w:p>
-            <w:r/>
-            <w:r>
-              <w:rPr>
-                <w:sz w:val="18"/>
-              </w:rPr>
-              <w:t>1.000</w:t>
-            </w:r>
-          </w:p>
-        </w:tc>
-        <w:tc>
-          <w:tcPr>
-            <w:tcW w:type="dxa" w:w="864"/>
-          </w:tcPr>
-          <w:p>
-            <w:r/>
-            <w:r>
-              <w:rPr>
-                <w:sz w:val="18"/>
-              </w:rPr>
-              <w:t>0.105</w:t>
-            </w:r>
-          </w:p>
-        </w:tc>
-      </w:tr>
-      <w:tr>
-        <w:tc>
-          <w:tcPr>
-            <w:tcW w:type="dxa" w:w="3456"/>
-          </w:tcPr>
-          <w:p>
-            <w:r/>
-            <w:r>
-              <w:rPr>
-                <w:sz w:val="18"/>
-              </w:rPr>
-              <w:t xml:space="preserve">  Age at surgery, years</w:t>
-            </w:r>
-          </w:p>
-        </w:tc>
-        <w:tc>
-          <w:tcPr>
-            <w:tcW w:type="dxa" w:w="1584"/>
-          </w:tcPr>
-          <w:p>
-            <w:r/>
-            <w:r>
-              <w:rPr>
-                <w:sz w:val="18"/>
-              </w:rPr>
-              <w:t>34.94 ± 8.03</w:t>
-            </w:r>
-          </w:p>
-        </w:tc>
-        <w:tc>
-          <w:tcPr>
-            <w:tcW w:type="dxa" w:w="1728"/>
-          </w:tcPr>
-          <w:p>
-            <w:r/>
-            <w:r>
-              <w:rPr>
-                <w:sz w:val="18"/>
-              </w:rPr>
-              <w:t>35.27 ± 7.38</w:t>
-            </w:r>
-          </w:p>
-        </w:tc>
-        <w:tc>
-          <w:tcPr>
-            <w:tcW w:type="dxa" w:w="864"/>
-          </w:tcPr>
-          <w:p>
-            <w:r/>
-            <w:r>
-              <w:rPr>
-                <w:sz w:val="18"/>
-              </w:rPr>
-              <w:t>0.724</w:t>
-            </w:r>
-          </w:p>
-        </w:tc>
-        <w:tc>
-          <w:tcPr>
-            <w:tcW w:type="dxa" w:w="864"/>
-          </w:tcPr>
-          <w:p>
-            <w:r/>
-            <w:r>
-              <w:rPr>
-                <w:sz w:val="18"/>
-              </w:rPr>
-              <w:t>0.043</w:t>
-            </w:r>
-          </w:p>
-        </w:tc>
-      </w:tr>
-      <w:tr>
-        <w:tc>
-          <w:tcPr>
-            <w:tcW w:type="dxa" w:w="3456"/>
-          </w:tcPr>
-          <w:p>
-            <w:r/>
-            <w:r>
-              <w:rPr>
-                <w:sz w:val="18"/>
-              </w:rPr>
-              <w:t xml:space="preserve">  Surgery year</w:t>
-            </w:r>
-          </w:p>
-        </w:tc>
-        <w:tc>
-          <w:tcPr>
-            <w:tcW w:type="dxa" w:w="1584"/>
-          </w:tcPr>
-          <w:p>
-            <w:r/>
-            <w:r>
-              <w:rPr>
-                <w:sz w:val="18"/>
-              </w:rPr>
-              <w:t>2016.05 ± 3.59</w:t>
-            </w:r>
-          </w:p>
-        </w:tc>
-        <w:tc>
-          <w:tcPr>
-            <w:tcW w:type="dxa" w:w="1728"/>
-          </w:tcPr>
-          <w:p>
-            <w:r/>
-            <w:r>
-              <w:rPr>
-                <w:sz w:val="18"/>
-              </w:rPr>
-              <w:t>2016.64 ± 3.28</w:t>
-            </w:r>
-          </w:p>
-        </w:tc>
-        <w:tc>
-          <w:tcPr>
-            <w:tcW w:type="dxa" w:w="864"/>
-          </w:tcPr>
-          <w:p>
-            <w:r/>
-            <w:r>
-              <w:rPr>
-                <w:sz w:val="18"/>
-              </w:rPr>
-              <w:t>0.163</w:t>
-            </w:r>
-          </w:p>
-        </w:tc>
-        <w:tc>
-          <w:tcPr>
-            <w:tcW w:type="dxa" w:w="864"/>
-          </w:tcPr>
-          <w:p>
-            <w:r/>
-            <w:r>
-              <w:rPr>
-                <w:sz w:val="18"/>
-              </w:rPr>
-              <w:t>0.171</w:t>
-            </w:r>
-          </w:p>
-        </w:tc>
-      </w:tr>
-      <w:tr>
-        <w:tc>
-          <w:tcPr>
-            <w:tcW w:type="dxa" w:w="3456"/>
-          </w:tcPr>
-          <w:p>
-            <w:r/>
-            <w:r>
-              <w:rPr>
-                <w:sz w:val="18"/>
-              </w:rPr>
-              <w:t xml:space="preserve">  Days surgery → index</w:t>
-            </w:r>
-          </w:p>
-        </w:tc>
-        <w:tc>
-          <w:tcPr>
-            <w:tcW w:type="dxa" w:w="1584"/>
-          </w:tcPr>
-          <w:p>
-            <w:r/>
-            <w:r>
-              <w:rPr>
-                <w:sz w:val="18"/>
-              </w:rPr>
-              <w:t>202.43 ± 268.29</w:t>
-            </w:r>
-          </w:p>
-        </w:tc>
-        <w:tc>
-          <w:tcPr>
-            <w:tcW w:type="dxa" w:w="1728"/>
-          </w:tcPr>
-          <w:p>
-            <w:r/>
-            <w:r>
-              <w:rPr>
-                <w:sz w:val="18"/>
-              </w:rPr>
-              <w:t>187.03 ± 233.92</w:t>
-            </w:r>
-          </w:p>
-        </w:tc>
-        <w:tc>
-          <w:tcPr>
-            <w:tcW w:type="dxa" w:w="864"/>
-          </w:tcPr>
-          <w:p>
-            <w:r/>
-            <w:r>
-              <w:rPr>
-                <w:sz w:val="18"/>
-              </w:rPr>
-              <w:t>0.619</w:t>
-            </w:r>
-          </w:p>
-        </w:tc>
-        <w:tc>
-          <w:tcPr>
-            <w:tcW w:type="dxa" w:w="864"/>
-          </w:tcPr>
-          <w:p>
-            <w:r/>
-            <w:r>
-              <w:rPr>
-                <w:sz w:val="18"/>
-              </w:rPr>
-              <w:t>0.061</w:t>
-            </w:r>
-          </w:p>
-        </w:tc>
-      </w:tr>
-      <w:tr>
-        <w:tc>
-          <w:tcPr>
-            <w:tcW w:type="dxa" w:w="3456"/>
-          </w:tcPr>
-          <w:p>
-            <w:r/>
-            <w:r>
-              <w:rPr>
-                <w:sz w:val="18"/>
-              </w:rPr>
-              <w:t>Follow-up</w:t>
-            </w:r>
-          </w:p>
-        </w:tc>
-        <w:tc>
-          <w:tcPr>
-            <w:tcW w:type="dxa" w:w="1584"/>
-          </w:tcPr>
-          <w:p>
-            <w:r/>
-            <w:r>
-              <w:rPr>
-                <w:sz w:val="18"/>
-              </w:rPr>
-            </w:r>
-          </w:p>
-        </w:tc>
-        <w:tc>
-          <w:tcPr>
-            <w:tcW w:type="dxa" w:w="1728"/>
-          </w:tcPr>
-          <w:p>
-            <w:r/>
-            <w:r>
-              <w:rPr>
-                <w:sz w:val="18"/>
-              </w:rPr>
-            </w:r>
-          </w:p>
-        </w:tc>
-        <w:tc>
-          <w:tcPr>
-            <w:tcW w:type="dxa" w:w="864"/>
-          </w:tcPr>
-          <w:p>
-            <w:r/>
-            <w:r>
-              <w:rPr>
-                <w:sz w:val="18"/>
-              </w:rPr>
-            </w:r>
-          </w:p>
-        </w:tc>
-        <w:tc>
-          <w:tcPr>
-            <w:tcW w:type="dxa" w:w="864"/>
-          </w:tcPr>
-          <w:p>
-            <w:r/>
-            <w:r>
-              <w:rPr>
-                <w:sz w:val="18"/>
-              </w:rPr>
-            </w:r>
-          </w:p>
-        </w:tc>
-      </w:tr>
-      <w:tr>
-        <w:tc>
-          <w:tcPr>
-            <w:tcW w:type="dxa" w:w="3456"/>
-          </w:tcPr>
-          <w:p>
-            <w:r/>
-            <w:r>
-              <w:rPr>
-                <w:sz w:val="18"/>
-              </w:rPr>
-              <w:t xml:space="preserve">  Follow-up days</w:t>
-            </w:r>
-          </w:p>
-        </w:tc>
-        <w:tc>
-          <w:tcPr>
-            <w:tcW w:type="dxa" w:w="1584"/>
-          </w:tcPr>
-          <w:p>
-            <w:r/>
-            <w:r>
-              <w:rPr>
-                <w:sz w:val="18"/>
-              </w:rPr>
-              <w:t>2264.60 ± 1396.24</w:t>
-            </w:r>
-          </w:p>
-        </w:tc>
-        <w:tc>
-          <w:tcPr>
-            <w:tcW w:type="dxa" w:w="1728"/>
-          </w:tcPr>
-          <w:p>
-            <w:r/>
-            <w:r>
-              <w:rPr>
-                <w:sz w:val="18"/>
-              </w:rPr>
-              <w:t>2111.74 ± 1228.42</w:t>
-            </w:r>
-          </w:p>
-        </w:tc>
-        <w:tc>
-          <w:tcPr>
-            <w:tcW w:type="dxa" w:w="864"/>
-          </w:tcPr>
-          <w:p>
-            <w:r/>
-            <w:r>
-              <w:rPr>
-                <w:sz w:val="18"/>
-              </w:rPr>
-              <w:t>0.344</w:t>
-            </w:r>
-          </w:p>
-        </w:tc>
-        <w:tc>
-          <w:tcPr>
-            <w:tcW w:type="dxa" w:w="864"/>
-          </w:tcPr>
-          <w:p>
-            <w:r/>
-            <w:r>
-              <w:rPr>
-                <w:sz w:val="18"/>
-              </w:rPr>
-              <w:t>0.116</w:t>
-            </w:r>
-          </w:p>
-        </w:tc>
-      </w:tr>
-      <w:tr>
-        <w:tc>
-          <w:tcPr>
-            <w:tcW w:type="dxa" w:w="3456"/>
-          </w:tcPr>
-          <w:p>
-            <w:r/>
-            <w:r>
-              <w:rPr>
-                <w:sz w:val="18"/>
-              </w:rPr>
-              <w:t xml:space="preserve">  Death during follow-up</w:t>
-            </w:r>
-          </w:p>
-        </w:tc>
-        <w:tc>
-          <w:tcPr>
-            <w:tcW w:type="dxa" w:w="1584"/>
-          </w:tcPr>
-          <w:p>
-            <w:r/>
-            <w:r>
-              <w:rPr>
-                <w:sz w:val="18"/>
-              </w:rPr>
-              <w:t>0 (0.0%)</w:t>
-            </w:r>
-          </w:p>
-        </w:tc>
-        <w:tc>
-          <w:tcPr>
-            <w:tcW w:type="dxa" w:w="1728"/>
-          </w:tcPr>
-          <w:p>
-            <w:r/>
-            <w:r>
-              <w:rPr>
-                <w:sz w:val="18"/>
-              </w:rPr>
-              <w:t>0 (0.0%)</w:t>
-            </w:r>
-          </w:p>
-        </w:tc>
-        <w:tc>
-          <w:tcPr>
-            <w:tcW w:type="dxa" w:w="864"/>
-          </w:tcPr>
-          <w:p>
-            <w:r/>
-            <w:r>
-              <w:rPr>
-                <w:sz w:val="18"/>
-              </w:rPr>
-              <w:t>1.000</w:t>
-            </w:r>
-          </w:p>
-        </w:tc>
-        <w:tc>
-          <w:tcPr>
-            <w:tcW w:type="dxa" w:w="864"/>
-          </w:tcPr>
-          <w:p>
-            <w:r/>
-            <w:r>
-              <w:rPr>
-                <w:sz w:val="18"/>
-              </w:rPr>
-              <w:t>-</w:t>
+              <w:t>0.542</w:t>
             </w:r>
           </w:p>
         </w:tc>

</xml_diff>

<commit_message>
Figures 2 and 3 percent ticks: 1 decimal place; unify Fig 2 y-axes by outcome
Per user feedback:

  - PercentFormatter decimals 0 -> 1 on Figure 2 (all five CIF panels)
    and Figure 3 (both panels) -- y-axis ticks now display one decimal
    place (e.g., 1.0%, 2.0%, 5.0% / 0.5%, 1.0%, 1.5%).

  - Figure 2 y-axis ranges unified by outcome family:
      panels (a) Any-of-5 composite and (c) Diabetes:
        ticks at 0%, 1%, 2%, 3%, 4%, 5% (ylim 0-0.05)
      panels (b) MCE composite, (d) Hypertension, (e) Angina/MI:
        ticks at 0%, 0.5%, 1%, 1.5%, 2% (ylim 0-0.02)
    so the visual scale is shared within each pair / triple, allowing
    direct vertical comparison of cumulative-incidence curves between
    panels of the same y-scale.

Co-Authored-By: Claude Opus 4.7 (1M context) <noreply@anthropic.com>
</commit_message>
<xml_diff>
--- a/docs/HPV_tables_figures.docx
+++ b/docs/HPV_tables_figures.docx
@@ -127,7 +127,7 @@
       <w:r>
         <w:drawing>
           <wp:inline xmlns:a="http://schemas.openxmlformats.org/drawingml/2006/main" xmlns:pic="http://schemas.openxmlformats.org/drawingml/2006/picture">
-            <wp:extent cx="5943600" cy="3708760"/>
+            <wp:extent cx="5943600" cy="3672866"/>
             <wp:docPr id="3" name="Picture 3"/>
             <wp:cNvGraphicFramePr>
               <a:graphicFrameLocks noChangeAspect="1"/>
@@ -148,7 +148,7 @@
                   <pic:spPr>
                     <a:xfrm>
                       <a:off x="0" y="0"/>
-                      <a:ext cx="5943600" cy="3708760"/>
+                      <a:ext cx="5943600" cy="3672866"/>
                     </a:xfrm>
                     <a:prstGeom prst="rect"/>
                   </pic:spPr>

</xml_diff>

<commit_message>
Figure 4: extend header divider to span the HR (95% CI) column
The column-header rule was drawn from x=0 to x=1 in axes fraction, but
the HR (95% CI) text is left-aligned at 0.92 and overflows past x=1, so
the rule appeared cut off short of the HR column. Extend it to
X_TABLE_RIGHT=1.10 (within the 0.12 inter-panel gap) so it spans the
full table width under every column. Regenerated PNG + tables_figures docx.

Co-Authored-By: Claude Opus 4.8 (1M context) <noreply@anthropic.com>
</commit_message>
<xml_diff>
--- a/docs/HPV_tables_figures.docx
+++ b/docs/HPV_tables_figures.docx
@@ -182,7 +182,7 @@
       <w:r>
         <w:drawing>
           <wp:inline xmlns:a="http://schemas.openxmlformats.org/drawingml/2006/main" xmlns:pic="http://schemas.openxmlformats.org/drawingml/2006/picture">
-            <wp:extent cx="6217920" cy="1840366"/>
+            <wp:extent cx="6217920" cy="1795783"/>
             <wp:docPr id="4" name="Picture 4"/>
             <wp:cNvGraphicFramePr>
               <a:graphicFrameLocks noChangeAspect="1"/>
@@ -203,7 +203,7 @@
                   <pic:spPr>
                     <a:xfrm>
                       <a:off x="0" y="0"/>
-                      <a:ext cx="6217920" cy="1840366"/>
+                      <a:ext cx="6217920" cy="1795783"/>
                     </a:xfrm>
                     <a:prstGeom prst="rect"/>
                   </pic:spPr>

</xml_diff>